<commit_message>
Testimonial and Certifications Added
</commit_message>
<xml_diff>
--- a/Student_Testimonial_Sivanesh_K.docx
+++ b/Student_Testimonial_Sivanesh_K.docx
@@ -23,12 +23,6 @@
         <w:gridCol w:w="9706"/>
       </w:tblGrid>
       <w:tr>
-        <w:tblPrEx>
-          <w:tblCellMar>
-            <w:top w:w="0" w:type="dxa"/>
-            <w:bottom w:w="0" w:type="dxa"/>
-          </w:tblCellMar>
-        </w:tblPrEx>
         <w:tc>
           <w:tcPr>
             <w:tcW w:w="0" w:type="auto"/>
@@ -95,6 +89,796 @@
       <w:pPr>
         <w:spacing w:after="200" w:line="340" w:lineRule="auto"/>
         <w:jc w:val="both"/>
+        <w:rPr>
+          <w:b/>
+          <w:bCs/>
+          <w:color w:val="24243E"/>
+          <w:sz w:val="22"/>
+          <w:szCs w:val="22"/>
+        </w:rPr>
+      </w:pPr>
+    </w:p>
+    <w:p>
+      <w:pPr>
+        <w:spacing w:after="200" w:line="340" w:lineRule="auto"/>
+        <w:jc w:val="both"/>
+        <w:rPr>
+          <w:b/>
+          <w:bCs/>
+          <w:color w:val="24243E"/>
+          <w:sz w:val="22"/>
+          <w:szCs w:val="22"/>
+        </w:rPr>
+      </w:pPr>
+      <w:r>
+        <w:rPr>
+          <w:b/>
+          <w:bCs/>
+          <w:color w:val="24243E"/>
+          <w:sz w:val="22"/>
+          <w:szCs w:val="22"/>
+        </w:rPr>
+        <w:t>1. Tell us about your background before joining the program. What was your family/financial situation like, and what were you hoping to achieve?</w:t>
+      </w:r>
+    </w:p>
+    <w:p>
+      <w:pPr>
+        <w:spacing w:after="200" w:line="340" w:lineRule="auto"/>
+        <w:jc w:val="both"/>
+        <w:rPr>
+          <w:color w:val="24243E"/>
+          <w:sz w:val="22"/>
+          <w:szCs w:val="22"/>
+        </w:rPr>
+      </w:pPr>
+      <w:r>
+        <w:rPr>
+          <w:color w:val="24243E"/>
+          <w:sz w:val="22"/>
+          <w:szCs w:val="22"/>
+        </w:rPr>
+        <w:t>I am a B.Tech Artificial Intelligence and Data Science student, and before joining the program, most of my learning was focused on academics, programming, and completing college projects. I was interested in Artificial Intelligence and Data Science, but I wanted to understand how these technologies are actually used to build practical solutions.</w:t>
+      </w:r>
+    </w:p>
+    <w:p>
+      <w:pPr>
+        <w:spacing w:after="200" w:line="340" w:lineRule="auto"/>
+        <w:jc w:val="both"/>
+        <w:rPr>
+          <w:color w:val="24243E"/>
+          <w:sz w:val="22"/>
+          <w:szCs w:val="22"/>
+        </w:rPr>
+      </w:pPr>
+      <w:r>
+        <w:rPr>
+          <w:color w:val="24243E"/>
+          <w:sz w:val="22"/>
+          <w:szCs w:val="22"/>
+        </w:rPr>
+        <w:t>As a student, I was also thinking seriously about my future career and how to become job-ready before graduation. I wanted to develop skills beyond classroom theory, especially in AI, cloud technologies, and real-world project development. My goal was to gain practical experience, build meaningful projects, and become more confident about entering the technology industry.</w:t>
+      </w:r>
+    </w:p>
+    <w:p>
+      <w:pPr>
+        <w:spacing w:after="200" w:line="340" w:lineRule="auto"/>
+        <w:jc w:val="both"/>
+        <w:rPr>
+          <w:color w:val="24243E"/>
+          <w:sz w:val="22"/>
+          <w:szCs w:val="22"/>
+        </w:rPr>
+      </w:pPr>
+      <w:r>
+        <w:rPr>
+          <w:color w:val="24243E"/>
+          <w:sz w:val="22"/>
+          <w:szCs w:val="22"/>
+        </w:rPr>
+        <w:pict w14:anchorId="599ED195">
+          <v:rect id="_x0000_i1049" style="width:0;height:1.5pt" o:hralign="center" o:hrstd="t" o:hr="t" fillcolor="#a0a0a0" stroked="f"/>
+        </w:pict>
+      </w:r>
+    </w:p>
+    <w:p>
+      <w:pPr>
+        <w:spacing w:after="200" w:line="340" w:lineRule="auto"/>
+        <w:jc w:val="both"/>
+        <w:rPr>
+          <w:b/>
+          <w:bCs/>
+          <w:color w:val="24243E"/>
+          <w:sz w:val="22"/>
+          <w:szCs w:val="22"/>
+        </w:rPr>
+      </w:pPr>
+      <w:r>
+        <w:rPr>
+          <w:b/>
+          <w:bCs/>
+          <w:color w:val="24243E"/>
+          <w:sz w:val="22"/>
+          <w:szCs w:val="22"/>
+        </w:rPr>
+        <w:t>2. How did you discover IBM SkillsBuild, and why did you decide to join? Did you have any doubts or fears?</w:t>
+      </w:r>
+    </w:p>
+    <w:p>
+      <w:pPr>
+        <w:spacing w:after="200" w:line="340" w:lineRule="auto"/>
+        <w:jc w:val="both"/>
+        <w:rPr>
+          <w:color w:val="24243E"/>
+          <w:sz w:val="22"/>
+          <w:szCs w:val="22"/>
+        </w:rPr>
+      </w:pPr>
+      <w:r>
+        <w:rPr>
+          <w:color w:val="24243E"/>
+          <w:sz w:val="22"/>
+          <w:szCs w:val="22"/>
+        </w:rPr>
+        <w:t>I discovered the IBM SkillsBuild program through the Edunet and AICTE initiative. I decided to join because it offered an opportunity to learn from IBM technologies and work on a practical AI project rather than only completing theoretical coursework.</w:t>
+      </w:r>
+    </w:p>
+    <w:p>
+      <w:pPr>
+        <w:spacing w:after="200" w:line="340" w:lineRule="auto"/>
+        <w:jc w:val="both"/>
+        <w:rPr>
+          <w:color w:val="24243E"/>
+          <w:sz w:val="22"/>
+          <w:szCs w:val="22"/>
+        </w:rPr>
+      </w:pPr>
+      <w:r>
+        <w:rPr>
+          <w:color w:val="24243E"/>
+          <w:sz w:val="22"/>
+          <w:szCs w:val="22"/>
+        </w:rPr>
+        <w:t>Initially, I had some doubts about whether I would be able to work with technologies such as IBM watsonx.ai, IBM Granite, RAG, and Agentic AI. These were areas where I had limited practical experience. I was also unsure whether I could turn an idea into a properly working end-to-end application.</w:t>
+      </w:r>
+    </w:p>
+    <w:p>
+      <w:pPr>
+        <w:spacing w:after="200" w:line="340" w:lineRule="auto"/>
+        <w:jc w:val="both"/>
+        <w:rPr>
+          <w:color w:val="24243E"/>
+          <w:sz w:val="22"/>
+          <w:szCs w:val="22"/>
+        </w:rPr>
+      </w:pPr>
+      <w:r>
+        <w:rPr>
+          <w:color w:val="24243E"/>
+          <w:sz w:val="22"/>
+          <w:szCs w:val="22"/>
+        </w:rPr>
+        <w:t xml:space="preserve">However, I decided that the best way to overcome that uncertainty was to actually build something. That decision led me to work on </w:t>
+      </w:r>
+      <w:r>
+        <w:rPr>
+          <w:b/>
+          <w:bCs/>
+          <w:color w:val="24243E"/>
+          <w:sz w:val="22"/>
+          <w:szCs w:val="22"/>
+        </w:rPr>
+        <w:t>Problem Statement No. 22 – Interview Trainer Agent</w:t>
+      </w:r>
+      <w:r>
+        <w:rPr>
+          <w:color w:val="24243E"/>
+          <w:sz w:val="22"/>
+          <w:szCs w:val="22"/>
+        </w:rPr>
+        <w:t>.</w:t>
+      </w:r>
+    </w:p>
+    <w:p>
+      <w:pPr>
+        <w:spacing w:after="200" w:line="340" w:lineRule="auto"/>
+        <w:jc w:val="both"/>
+        <w:rPr>
+          <w:color w:val="24243E"/>
+          <w:sz w:val="22"/>
+          <w:szCs w:val="22"/>
+        </w:rPr>
+      </w:pPr>
+      <w:r>
+        <w:rPr>
+          <w:color w:val="24243E"/>
+          <w:sz w:val="22"/>
+          <w:szCs w:val="22"/>
+        </w:rPr>
+        <w:pict w14:anchorId="3CDB296E">
+          <v:rect id="_x0000_i1050" style="width:0;height:1.5pt" o:hralign="center" o:hrstd="t" o:hr="t" fillcolor="#a0a0a0" stroked="f"/>
+        </w:pict>
+      </w:r>
+    </w:p>
+    <w:p>
+      <w:pPr>
+        <w:spacing w:after="200" w:line="340" w:lineRule="auto"/>
+        <w:jc w:val="both"/>
+        <w:rPr>
+          <w:b/>
+          <w:bCs/>
+          <w:color w:val="24243E"/>
+          <w:sz w:val="22"/>
+          <w:szCs w:val="22"/>
+        </w:rPr>
+      </w:pPr>
+    </w:p>
+    <w:p>
+      <w:pPr>
+        <w:spacing w:after="200" w:line="340" w:lineRule="auto"/>
+        <w:jc w:val="both"/>
+        <w:rPr>
+          <w:b/>
+          <w:bCs/>
+          <w:color w:val="24243E"/>
+          <w:sz w:val="22"/>
+          <w:szCs w:val="22"/>
+        </w:rPr>
+      </w:pPr>
+    </w:p>
+    <w:p>
+      <w:pPr>
+        <w:spacing w:after="200" w:line="340" w:lineRule="auto"/>
+        <w:jc w:val="both"/>
+        <w:rPr>
+          <w:b/>
+          <w:bCs/>
+          <w:color w:val="24243E"/>
+          <w:sz w:val="22"/>
+          <w:szCs w:val="22"/>
+        </w:rPr>
+      </w:pPr>
+    </w:p>
+    <w:p>
+      <w:pPr>
+        <w:spacing w:after="200" w:line="340" w:lineRule="auto"/>
+        <w:jc w:val="both"/>
+        <w:rPr>
+          <w:b/>
+          <w:bCs/>
+          <w:color w:val="24243E"/>
+          <w:sz w:val="22"/>
+          <w:szCs w:val="22"/>
+        </w:rPr>
+      </w:pPr>
+    </w:p>
+    <w:p>
+      <w:pPr>
+        <w:spacing w:after="200" w:line="340" w:lineRule="auto"/>
+        <w:jc w:val="both"/>
+        <w:rPr>
+          <w:b/>
+          <w:bCs/>
+          <w:color w:val="24243E"/>
+          <w:sz w:val="22"/>
+          <w:szCs w:val="22"/>
+        </w:rPr>
+      </w:pPr>
+      <w:r>
+        <w:rPr>
+          <w:b/>
+          <w:bCs/>
+          <w:color w:val="24243E"/>
+          <w:sz w:val="22"/>
+          <w:szCs w:val="22"/>
+        </w:rPr>
+        <w:lastRenderedPageBreak/>
+        <w:t>3. What did you learn during the program? Was there a particular moment, mentor, or experience that stood out?</w:t>
+      </w:r>
+    </w:p>
+    <w:p>
+      <w:pPr>
+        <w:spacing w:after="200" w:line="340" w:lineRule="auto"/>
+        <w:jc w:val="both"/>
+        <w:rPr>
+          <w:color w:val="24243E"/>
+          <w:sz w:val="22"/>
+          <w:szCs w:val="22"/>
+        </w:rPr>
+      </w:pPr>
+      <w:r>
+        <w:rPr>
+          <w:color w:val="24243E"/>
+          <w:sz w:val="22"/>
+          <w:szCs w:val="22"/>
+        </w:rPr>
+        <w:t>The program taught me much more than simply using an AI model. I learned how to approach an AI problem systematically and convert an idea into a complete working solution.</w:t>
+      </w:r>
+    </w:p>
+    <w:p>
+      <w:pPr>
+        <w:spacing w:after="200" w:line="340" w:lineRule="auto"/>
+        <w:jc w:val="both"/>
+        <w:rPr>
+          <w:color w:val="24243E"/>
+          <w:sz w:val="22"/>
+          <w:szCs w:val="22"/>
+        </w:rPr>
+      </w:pPr>
+      <w:r>
+        <w:rPr>
+          <w:color w:val="24243E"/>
+          <w:sz w:val="22"/>
+          <w:szCs w:val="22"/>
+        </w:rPr>
+        <w:t xml:space="preserve">For my project, </w:t>
+      </w:r>
+      <w:r>
+        <w:rPr>
+          <w:b/>
+          <w:bCs/>
+          <w:color w:val="24243E"/>
+          <w:sz w:val="22"/>
+          <w:szCs w:val="22"/>
+        </w:rPr>
+        <w:t>AI Interview Coach</w:t>
+      </w:r>
+      <w:r>
+        <w:rPr>
+          <w:color w:val="24243E"/>
+          <w:sz w:val="22"/>
+          <w:szCs w:val="22"/>
+        </w:rPr>
+        <w:t xml:space="preserve">, I worked with </w:t>
+      </w:r>
+      <w:r>
+        <w:rPr>
+          <w:b/>
+          <w:bCs/>
+          <w:color w:val="24243E"/>
+          <w:sz w:val="22"/>
+          <w:szCs w:val="22"/>
+        </w:rPr>
+        <w:t>IBM watsonx.ai and IBM Granite</w:t>
+      </w:r>
+      <w:r>
+        <w:rPr>
+          <w:color w:val="24243E"/>
+          <w:sz w:val="22"/>
+          <w:szCs w:val="22"/>
+        </w:rPr>
+        <w:t xml:space="preserve"> to build an AI-powered interview preparation system. I learned how </w:t>
+      </w:r>
+      <w:r>
+        <w:rPr>
+          <w:b/>
+          <w:bCs/>
+          <w:color w:val="24243E"/>
+          <w:sz w:val="22"/>
+          <w:szCs w:val="22"/>
+        </w:rPr>
+        <w:t>Retrieval-Augmented Generation (RAG)</w:t>
+      </w:r>
+      <w:r>
+        <w:rPr>
+          <w:color w:val="24243E"/>
+          <w:sz w:val="22"/>
+          <w:szCs w:val="22"/>
+        </w:rPr>
+        <w:t xml:space="preserve"> can provide relevant knowledge to an AI system, and how specialized agents can be used for different responsibilities.</w:t>
+      </w:r>
+    </w:p>
+    <w:p>
+      <w:pPr>
+        <w:spacing w:after="200" w:line="340" w:lineRule="auto"/>
+        <w:jc w:val="both"/>
+        <w:rPr>
+          <w:color w:val="24243E"/>
+          <w:sz w:val="22"/>
+          <w:szCs w:val="22"/>
+        </w:rPr>
+      </w:pPr>
+      <w:r>
+        <w:rPr>
+          <w:color w:val="24243E"/>
+          <w:sz w:val="22"/>
+          <w:szCs w:val="22"/>
+        </w:rPr>
+        <w:t>The most valuable experience was making the system work as an actual interview coach rather than just a chatbot. I implemented an adaptive interview flow where the system generates questions, evaluates answers across multiple dimensions, and produces a final performance report. Working through issues in the RAG pipeline, model responses, session handling, and API integration taught me how much problem-solving is involved in building a real AI application.</w:t>
+      </w:r>
+    </w:p>
+    <w:p>
+      <w:pPr>
+        <w:spacing w:after="200" w:line="340" w:lineRule="auto"/>
+        <w:jc w:val="both"/>
+        <w:rPr>
+          <w:color w:val="24243E"/>
+          <w:sz w:val="22"/>
+          <w:szCs w:val="22"/>
+        </w:rPr>
+      </w:pPr>
+      <w:r>
+        <w:rPr>
+          <w:color w:val="24243E"/>
+          <w:sz w:val="22"/>
+          <w:szCs w:val="22"/>
+        </w:rPr>
+        <w:t>The program also helped me understand that building AI solutions requires more than knowing Python or prompting a model. It requires architecture, testing, debugging, evaluation, and continuous improvement.</w:t>
+      </w:r>
+    </w:p>
+    <w:p>
+      <w:pPr>
+        <w:spacing w:after="200" w:line="340" w:lineRule="auto"/>
+        <w:jc w:val="both"/>
+        <w:rPr>
+          <w:color w:val="24243E"/>
+          <w:sz w:val="22"/>
+          <w:szCs w:val="22"/>
+        </w:rPr>
+      </w:pPr>
+      <w:r>
+        <w:rPr>
+          <w:color w:val="24243E"/>
+          <w:sz w:val="22"/>
+          <w:szCs w:val="22"/>
+        </w:rPr>
+        <w:pict w14:anchorId="3ED134CE">
+          <v:rect id="_x0000_i1051" style="width:0;height:1.5pt" o:hralign="center" o:hrstd="t" o:hr="t" fillcolor="#a0a0a0" stroked="f"/>
+        </w:pict>
+      </w:r>
+    </w:p>
+    <w:p>
+      <w:pPr>
+        <w:spacing w:after="200" w:line="340" w:lineRule="auto"/>
+        <w:jc w:val="both"/>
+        <w:rPr>
+          <w:b/>
+          <w:bCs/>
+          <w:color w:val="24243E"/>
+          <w:sz w:val="22"/>
+          <w:szCs w:val="22"/>
+        </w:rPr>
+      </w:pPr>
+      <w:r>
+        <w:rPr>
+          <w:b/>
+          <w:bCs/>
+          <w:color w:val="24243E"/>
+          <w:sz w:val="22"/>
+          <w:szCs w:val="22"/>
+        </w:rPr>
+        <w:t>4. How has your life changed since completing the program? Has it affected your confidence, skills, family, or career prospects?</w:t>
+      </w:r>
+    </w:p>
+    <w:p>
+      <w:pPr>
+        <w:spacing w:after="200" w:line="340" w:lineRule="auto"/>
+        <w:jc w:val="both"/>
+        <w:rPr>
+          <w:color w:val="24243E"/>
+          <w:sz w:val="22"/>
+          <w:szCs w:val="22"/>
+        </w:rPr>
+      </w:pPr>
+      <w:r>
+        <w:rPr>
+          <w:color w:val="24243E"/>
+          <w:sz w:val="22"/>
+          <w:szCs w:val="22"/>
+        </w:rPr>
+        <w:t>The biggest change has been in my confidence. Earlier, I could understand AI concepts and write programs, but I was less confident about building a complete AI application using industry-oriented technologies.</w:t>
+      </w:r>
+    </w:p>
+    <w:p>
+      <w:pPr>
+        <w:spacing w:after="200" w:line="340" w:lineRule="auto"/>
+        <w:jc w:val="both"/>
+        <w:rPr>
+          <w:color w:val="24243E"/>
+          <w:sz w:val="22"/>
+          <w:szCs w:val="22"/>
+        </w:rPr>
+      </w:pPr>
+      <w:r>
+        <w:rPr>
+          <w:color w:val="24243E"/>
+          <w:sz w:val="22"/>
+          <w:szCs w:val="22"/>
+        </w:rPr>
+        <w:t xml:space="preserve">After completing this project, I have a much clearer understanding of how technologies such as </w:t>
+      </w:r>
+      <w:r>
+        <w:rPr>
+          <w:b/>
+          <w:bCs/>
+          <w:color w:val="24243E"/>
+          <w:sz w:val="22"/>
+          <w:szCs w:val="22"/>
+        </w:rPr>
+        <w:t>IBM Granite, watsonx.ai, RAG, Agentic AI, FastAPI, vector databases, and cloud services</w:t>
+      </w:r>
+      <w:r>
+        <w:rPr>
+          <w:color w:val="24243E"/>
+          <w:sz w:val="22"/>
+          <w:szCs w:val="22"/>
+        </w:rPr>
+        <w:t xml:space="preserve"> can work together in a practical system.</w:t>
+      </w:r>
+    </w:p>
+    <w:p>
+      <w:pPr>
+        <w:spacing w:after="200" w:line="340" w:lineRule="auto"/>
+        <w:jc w:val="both"/>
+        <w:rPr>
+          <w:color w:val="24243E"/>
+          <w:sz w:val="22"/>
+          <w:szCs w:val="22"/>
+        </w:rPr>
+      </w:pPr>
+      <w:r>
+        <w:rPr>
+          <w:color w:val="24243E"/>
+          <w:sz w:val="22"/>
+          <w:szCs w:val="22"/>
+        </w:rPr>
+        <w:t>The experience has also improved the way I approach problems. Instead of thinking only about writing code, I now think about the complete solution — the user problem, system architecture, AI workflow, data retrieval, evaluation, testing, and deployment.</w:t>
+      </w:r>
+    </w:p>
+    <w:p>
+      <w:pPr>
+        <w:spacing w:after="200" w:line="340" w:lineRule="auto"/>
+        <w:jc w:val="both"/>
+        <w:rPr>
+          <w:color w:val="24243E"/>
+          <w:sz w:val="22"/>
+          <w:szCs w:val="22"/>
+        </w:rPr>
+      </w:pPr>
+      <w:r>
+        <w:rPr>
+          <w:color w:val="24243E"/>
+          <w:sz w:val="22"/>
+          <w:szCs w:val="22"/>
+        </w:rPr>
+        <w:t xml:space="preserve">This experience has strengthened my portfolio and given me a project that I can discuss during interviews. More importantly, it has made me more confident about pursuing opportunities in </w:t>
+      </w:r>
+      <w:r>
+        <w:rPr>
+          <w:b/>
+          <w:bCs/>
+          <w:color w:val="24243E"/>
+          <w:sz w:val="22"/>
+          <w:szCs w:val="22"/>
+        </w:rPr>
+        <w:t>AI, Data Science, and software development</w:t>
+      </w:r>
+      <w:r>
+        <w:rPr>
+          <w:color w:val="24243E"/>
+          <w:sz w:val="22"/>
+          <w:szCs w:val="22"/>
+        </w:rPr>
+        <w:t>. It has shown me that I can learn unfamiliar technologies and use them to build something meaningful.</w:t>
+      </w:r>
+    </w:p>
+    <w:p>
+      <w:pPr>
+        <w:spacing w:after="200" w:line="340" w:lineRule="auto"/>
+        <w:jc w:val="both"/>
+        <w:rPr>
+          <w:color w:val="24243E"/>
+          <w:sz w:val="22"/>
+          <w:szCs w:val="22"/>
+        </w:rPr>
+      </w:pPr>
+      <w:r>
+        <w:rPr>
+          <w:color w:val="24243E"/>
+          <w:sz w:val="22"/>
+          <w:szCs w:val="22"/>
+        </w:rPr>
+        <w:pict w14:anchorId="7AE3A67D">
+          <v:rect id="_x0000_i1052" style="width:0;height:1.5pt" o:hralign="center" o:hrstd="t" o:hr="t" fillcolor="#a0a0a0" stroked="f"/>
+        </w:pict>
+      </w:r>
+    </w:p>
+    <w:p>
+      <w:pPr>
+        <w:spacing w:after="200" w:line="340" w:lineRule="auto"/>
+        <w:jc w:val="both"/>
+        <w:rPr>
+          <w:b/>
+          <w:bCs/>
+          <w:color w:val="24243E"/>
+          <w:sz w:val="22"/>
+          <w:szCs w:val="22"/>
+        </w:rPr>
+      </w:pPr>
+    </w:p>
+    <w:p>
+      <w:pPr>
+        <w:spacing w:after="200" w:line="340" w:lineRule="auto"/>
+        <w:jc w:val="both"/>
+        <w:rPr>
+          <w:b/>
+          <w:bCs/>
+          <w:color w:val="24243E"/>
+          <w:sz w:val="22"/>
+          <w:szCs w:val="22"/>
+        </w:rPr>
+      </w:pPr>
+    </w:p>
+    <w:p>
+      <w:pPr>
+        <w:spacing w:after="200" w:line="340" w:lineRule="auto"/>
+        <w:jc w:val="both"/>
+        <w:rPr>
+          <w:b/>
+          <w:bCs/>
+          <w:color w:val="24243E"/>
+          <w:sz w:val="22"/>
+          <w:szCs w:val="22"/>
+        </w:rPr>
+      </w:pPr>
+    </w:p>
+    <w:p>
+      <w:pPr>
+        <w:spacing w:after="200" w:line="340" w:lineRule="auto"/>
+        <w:jc w:val="both"/>
+        <w:rPr>
+          <w:b/>
+          <w:bCs/>
+          <w:color w:val="24243E"/>
+          <w:sz w:val="22"/>
+          <w:szCs w:val="22"/>
+        </w:rPr>
+      </w:pPr>
+      <w:r>
+        <w:rPr>
+          <w:b/>
+          <w:bCs/>
+          <w:color w:val="24243E"/>
+          <w:sz w:val="22"/>
+          <w:szCs w:val="22"/>
+        </w:rPr>
+        <w:lastRenderedPageBreak/>
+        <w:t>5. What would you say to someone who is hesitant about joining IBM SkillsBuild?</w:t>
+      </w:r>
+    </w:p>
+    <w:p>
+      <w:pPr>
+        <w:spacing w:after="200" w:line="340" w:lineRule="auto"/>
+        <w:jc w:val="both"/>
+        <w:rPr>
+          <w:color w:val="24243E"/>
+          <w:sz w:val="22"/>
+          <w:szCs w:val="22"/>
+        </w:rPr>
+      </w:pPr>
+      <w:r>
+        <w:rPr>
+          <w:color w:val="24243E"/>
+          <w:sz w:val="22"/>
+          <w:szCs w:val="22"/>
+        </w:rPr>
+        <w:t>I would tell them not to wait until they feel completely ready.</w:t>
+      </w:r>
+    </w:p>
+    <w:p>
+      <w:pPr>
+        <w:spacing w:after="200" w:line="340" w:lineRule="auto"/>
+        <w:jc w:val="both"/>
+        <w:rPr>
+          <w:color w:val="24243E"/>
+          <w:sz w:val="22"/>
+          <w:szCs w:val="22"/>
+        </w:rPr>
+      </w:pPr>
+      <w:r>
+        <w:rPr>
+          <w:color w:val="24243E"/>
+          <w:sz w:val="22"/>
+          <w:szCs w:val="22"/>
+        </w:rPr>
+        <w:t>When I started, I did not know everything required to build an AI application using IBM technologies. There were concepts and tools that were new to me, and I had doubts about whether I could complete the project successfully. But the experience of actually building the solution was far more valuable than simply studying the concepts.</w:t>
+      </w:r>
+    </w:p>
+    <w:p>
+      <w:pPr>
+        <w:spacing w:after="200" w:line="340" w:lineRule="auto"/>
+        <w:jc w:val="both"/>
+        <w:rPr>
+          <w:color w:val="24243E"/>
+          <w:sz w:val="22"/>
+          <w:szCs w:val="22"/>
+        </w:rPr>
+      </w:pPr>
+      <w:r>
+        <w:rPr>
+          <w:color w:val="24243E"/>
+          <w:sz w:val="22"/>
+          <w:szCs w:val="22"/>
+        </w:rPr>
+        <w:t>The important thing is to be willing to learn, experiment, make mistakes, debug problems, and keep improving. A program like IBM SkillsBuild can give you the opportunity to work with technologies that you may not encounter deeply in regular college coursework.</w:t>
+      </w:r>
+    </w:p>
+    <w:p>
+      <w:pPr>
+        <w:spacing w:after="200" w:line="340" w:lineRule="auto"/>
+        <w:jc w:val="both"/>
+        <w:rPr>
+          <w:color w:val="24243E"/>
+          <w:sz w:val="22"/>
+          <w:szCs w:val="22"/>
+        </w:rPr>
+      </w:pPr>
+      <w:r>
+        <w:rPr>
+          <w:color w:val="24243E"/>
+          <w:sz w:val="22"/>
+          <w:szCs w:val="22"/>
+        </w:rPr>
+        <w:t xml:space="preserve">If you are a student who wants to become more industry-ready, I would strongly recommend taking the opportunity seriously. </w:t>
+      </w:r>
+      <w:r>
+        <w:rPr>
+          <w:b/>
+          <w:bCs/>
+          <w:color w:val="24243E"/>
+          <w:sz w:val="22"/>
+          <w:szCs w:val="22"/>
+        </w:rPr>
+        <w:t>Don't join just to obtain a certificate. Join to build something, learn something you didn't know before, and prove to yourself that you can create a real solution.</w:t>
+      </w:r>
+    </w:p>
+    <w:p>
+      <w:pPr>
+        <w:spacing w:after="200" w:line="340" w:lineRule="auto"/>
+        <w:jc w:val="both"/>
+        <w:rPr>
+          <w:color w:val="24243E"/>
+          <w:sz w:val="22"/>
+          <w:szCs w:val="22"/>
+        </w:rPr>
+      </w:pPr>
+    </w:p>
+    <w:p>
+      <w:pPr>
+        <w:spacing w:after="200" w:line="340" w:lineRule="auto"/>
+        <w:jc w:val="both"/>
+        <w:rPr>
+          <w:color w:val="24243E"/>
+          <w:sz w:val="22"/>
+          <w:szCs w:val="22"/>
+        </w:rPr>
+      </w:pPr>
+    </w:p>
+    <w:p>
+      <w:pPr>
+        <w:spacing w:after="200" w:line="340" w:lineRule="auto"/>
+        <w:jc w:val="both"/>
+        <w:rPr>
+          <w:color w:val="24243E"/>
+          <w:sz w:val="22"/>
+          <w:szCs w:val="22"/>
+        </w:rPr>
+      </w:pPr>
+    </w:p>
+    <w:p>
+      <w:pPr>
+        <w:spacing w:after="200" w:line="340" w:lineRule="auto"/>
+        <w:jc w:val="both"/>
+        <w:rPr>
+          <w:color w:val="24243E"/>
+          <w:sz w:val="22"/>
+          <w:szCs w:val="22"/>
+        </w:rPr>
+      </w:pPr>
+    </w:p>
+    <w:p>
+      <w:pPr>
+        <w:spacing w:after="200" w:line="340" w:lineRule="auto"/>
+        <w:jc w:val="both"/>
       </w:pPr>
       <w:r>
         <w:rPr>
@@ -144,6 +928,7 @@
           <w:sz w:val="22"/>
           <w:szCs w:val="22"/>
         </w:rPr>
+        <w:lastRenderedPageBreak/>
         <w:t>The RAG pipeline itself was the most technically demanding part of the project. I built a knowledge base of technical questions, behavioral scenarios, and HR guidance, embedded it, and stored it in a ChromaDB + SQLite vector store so the agent could retrieve context before generating any response. Watching the quality of the generated questions improve once retrieval was grounded in real data — instead of the model simply hallucinating generic interview questions — was one of the most satisfying debugging moments of the whole internship.</w:t>
       </w:r>
     </w:p>
@@ -172,16 +957,7 @@
           <w:sz w:val="22"/>
           <w:szCs w:val="22"/>
         </w:rPr>
-        <w:t xml:space="preserve">I am submitting this testimonial as a genuine reflection of my experience: this internship gave me hands-on exposure to enterprise-grade AI tools that most students only read about, and it pushed me to build something that could realistically help someone walk into an interview more prepared and more confident. I am proud of what I built, grateful for the guidance from the AICTE–IBM–Edunet Foundation program, and excited to keep </w:t>
-      </w:r>
-      <w:r>
-        <w:rPr>
-          <w:color w:val="24243E"/>
-          <w:sz w:val="22"/>
-          <w:szCs w:val="22"/>
-        </w:rPr>
-        <w:lastRenderedPageBreak/>
-        <w:t>extending this project further — including multilingual support, voice-based practice, and deeper resume analysis.</w:t>
+        <w:t>I am submitting this testimonial as a genuine reflection of my experience: this internship gave me hands-on exposure to enterprise-grade AI tools that most students only read about, and it pushed me to build something that could realistically help someone walk into an interview more prepared and more confident. I am proud of what I built, grateful for the guidance from the AICTE–IBM–Edunet Foundation program, and excited to keep extending this project further — including multilingual support, voice-based practice, and deeper resume analysis.</w:t>
       </w:r>
     </w:p>
     <w:tbl>
@@ -208,12 +984,6 @@
         <w:gridCol w:w="2432"/>
       </w:tblGrid>
       <w:tr>
-        <w:tblPrEx>
-          <w:tblCellMar>
-            <w:top w:w="0" w:type="dxa"/>
-            <w:bottom w:w="0" w:type="dxa"/>
-          </w:tblCellMar>
-        </w:tblPrEx>
         <w:tc>
           <w:tcPr>
             <w:tcW w:w="2500" w:type="dxa"/>
@@ -1241,7 +2011,6 @@
   <w:style w:type="character" w:default="1" w:styleId="DefaultParagraphFont">
     <w:name w:val="Default Paragraph Font"/>
     <w:uiPriority w:val="1"/>
-    <w:semiHidden/>
     <w:unhideWhenUsed/>
   </w:style>
   <w:style w:type="table" w:default="1" w:styleId="TableNormal">

</xml_diff>